<commit_message>
Rebuild the user guide: background-prepared downloads
</commit_message>
<xml_diff>
--- a/docs/product/WardPay - user guide.docx
+++ b/docs/product/WardPay - user guide.docx
@@ -9156,7 +9156,24 @@
           <w:sz w:val="22"/>
           <w:szCs w:val="22"/>
         </w:rPr>
-        <w:t xml:space="preserve">Go to Reports → For your accountant, choose the dates, and press Download Excel (journal, account totals, chart of accounts) or Download CSV (for accounting software).</w:t>
+        <w:t xml:space="preserve">Go to Reports → For your accountant and choose the dates.</w:t>
+      </w:r>
+    </w:p>
+    <w:p>
+      <w:pPr>
+        <w:pStyle w:val="ListParagraph"/>
+        <w:numPr>
+          <w:ilvl w:val="0"/>
+          <w:numId w:val="56"/>
+        </w:numPr>
+        <w:spacing w:after="60"/>
+      </w:pPr>
+      <w:r>
+        <w:rPr>
+          <w:sz w:val="22"/>
+          <w:szCs w:val="22"/>
+        </w:rPr>
+        <w:t xml:space="preserve">Press Download Excel (journal, account totals, chart of accounts) or Download CSV (for accounting software). The file is prepared first; for a long period at a big school this can take a minute. Keep the page open and it downloads by itself.</w:t>
       </w:r>
     </w:p>
     <w:p>
@@ -9516,6 +9533,55 @@
           <w:szCs w:val="22"/>
         </w:rPr>
         <w:t xml:space="preserve">Under End-of-session pack, choose the school year and press Download the pack. For the current year it runs to today.</w:t>
+      </w:r>
+    </w:p>
+    <w:p>
+      <w:pPr>
+        <w:pStyle w:val="ListParagraph"/>
+        <w:numPr>
+          <w:ilvl w:val="0"/>
+          <w:numId w:val="59"/>
+        </w:numPr>
+        <w:spacing w:after="60"/>
+      </w:pPr>
+      <w:r>
+        <w:rPr>
+          <w:sz w:val="22"/>
+          <w:szCs w:val="22"/>
+        </w:rPr>
+        <w:t xml:space="preserve">The pack is prepared first (the button says Preparing…) and downloads by itself when ready.</w:t>
+      </w:r>
+    </w:p>
+    <w:p>
+      <w:pPr>
+        <w:spacing w:after="60" w:before="80"/>
+      </w:pPr>
+      <w:r>
+        <w:rPr>
+          <w:b/>
+          <w:bCs/>
+          <w:color w:val="0F5132"/>
+          <w:sz w:val="22"/>
+          <w:szCs w:val="22"/>
+        </w:rPr>
+        <w:t xml:space="preserve">Good to know</w:t>
+      </w:r>
+    </w:p>
+    <w:p>
+      <w:pPr>
+        <w:pStyle w:val="ListParagraph"/>
+        <w:numPr>
+          <w:ilvl w:val="0"/>
+          <w:numId w:val="3"/>
+        </w:numPr>
+        <w:spacing w:after="60"/>
+      </w:pPr>
+      <w:r>
+        <w:rPr>
+          <w:sz w:val="22"/>
+          <w:szCs w:val="22"/>
+        </w:rPr>
+        <w:t xml:space="preserve">A prepared file can only be downloaded by the person who asked for it, and is deleted after a day.</w:t>
       </w:r>
     </w:p>
     <w:p>
@@ -10669,6 +10735,64 @@
                 <w:szCs w:val="21"/>
               </w:rPr>
               <w:t xml:space="preserve">Change</w:t>
+            </w:r>
+          </w:p>
+        </w:tc>
+      </w:tr>
+      <w:tr>
+        <w:tc>
+          <w:tcPr>
+            <w:tcW w:type="dxa" w:w="1900"/>
+            <w:tcBorders>
+              <w:top w:val="single" w:color="D0D7D3" w:sz="4"/>
+              <w:left w:val="single" w:color="D0D7D3" w:sz="4"/>
+              <w:bottom w:val="single" w:color="D0D7D3" w:sz="4"/>
+              <w:right w:val="single" w:color="D0D7D3" w:sz="4"/>
+            </w:tcBorders>
+            <w:tcMar>
+              <w:top w:type="dxa" w:w="80"/>
+              <w:left w:type="dxa" w:w="120"/>
+              <w:bottom w:type="dxa" w:w="80"/>
+              <w:right w:type="dxa" w:w="120"/>
+            </w:tcMar>
+          </w:tcPr>
+          <w:p>
+            <w:r>
+              <w:rPr>
+                <w:b w:val="false"/>
+                <w:bCs w:val="false"/>
+                <w:sz w:val="21"/>
+                <w:szCs w:val="21"/>
+              </w:rPr>
+              <w:t xml:space="preserve">24 Oct 2026</w:t>
+            </w:r>
+          </w:p>
+        </w:tc>
+        <w:tc>
+          <w:tcPr>
+            <w:tcW w:type="dxa" w:w="7738"/>
+            <w:tcBorders>
+              <w:top w:val="single" w:color="D0D7D3" w:sz="4"/>
+              <w:left w:val="single" w:color="D0D7D3" w:sz="4"/>
+              <w:bottom w:val="single" w:color="D0D7D3" w:sz="4"/>
+              <w:right w:val="single" w:color="D0D7D3" w:sz="4"/>
+            </w:tcBorders>
+            <w:tcMar>
+              <w:top w:type="dxa" w:w="80"/>
+              <w:left w:type="dxa" w:w="120"/>
+              <w:bottom w:type="dxa" w:w="80"/>
+              <w:right w:type="dxa" w:w="120"/>
+            </w:tcMar>
+          </w:tcPr>
+          <w:p>
+            <w:r>
+              <w:rPr>
+                <w:b w:val="false"/>
+                <w:bCs w:val="false"/>
+                <w:sz w:val="21"/>
+                <w:szCs w:val="21"/>
+              </w:rPr>
+              <w:t xml:space="preserve">The journal and the end-of-session pack are now prepared in the background, then download by themselves.</w:t>
             </w:r>
           </w:p>
         </w:tc>

</xml_diff>